<commit_message>
002 R1.3_3: desglose sin la lista de configuracion
Co-Authored-By: Claude Opus 5.5 <noreply@anthropic.com>
Claude-Session: https://claude.ai/code/session_01DbpSpoM7qi5cJ9LMKpwgVv
</commit_message>
<xml_diff>
--- a/002/002_DESTRUCTURAL_H5H6_R1.3_3.docx
+++ b/002/002_DESTRUCTURAL_H5H6_R1.3_3.docx
@@ -791,171 +791,6 @@
     </w:tbl>
     <w:p>
       <w:pPr>
-        <w:spacing w:before="60" w:after="80"/>
-        <w:jc w:val="both"/>
-      </w:pPr>
-      <w:r>
-        <w:rPr>
-          <w:rFonts w:ascii="Arial" w:hAnsi="Arial" w:cs="Arial"/>
-          <w:b w:val="0"/>
-          <w:i/>
-          <w:sz w:val="16"/>
-        </w:rPr>
-        <w:t>Peso de elementos: longitudes del modelo × peso unitario de cada sección (mismo criterio que el STEEL MEMBER TAKE OFF de STAAD, con todos los miembros). Conexiones: 5 %. Factores del espectro de la hoja de sismo con el peso dinámico de 12,621.74 kg (modos del motor de análisis; se confirman con la corrida de STAAD).</w:t>
-      </w:r>
-    </w:p>
-    <w:p>
-      <w:pPr>
-        <w:spacing w:before="160" w:after="80"/>
-        <w:jc w:val="left"/>
-      </w:pPr>
-      <w:r>
-        <w:rPr>
-          <w:rFonts w:ascii="Arial" w:hAnsi="Arial" w:cs="Arial"/>
-          <w:b/>
-          <w:i w:val="0"/>
-          <w:sz w:val="20"/>
-        </w:rPr>
-        <w:t>II. CONFIGURACIÓN DE LA R1.3_3</w:t>
-      </w:r>
-    </w:p>
-    <w:p>
-      <w:pPr>
-        <w:spacing w:before="0" w:after="40"/>
-        <w:jc w:val="both"/>
-      </w:pPr>
-      <w:r>
-        <w:rPr>
-          <w:rFonts w:ascii="Arial" w:hAnsi="Arial" w:cs="Arial"/>
-          <w:b w:val="0"/>
-          <w:i w:val="0"/>
-          <w:sz w:val="17"/>
-        </w:rPr>
-        <w:t>•  Columnas IR en 3 pares (un perfil por eje): eje 1 W10X22, eje 2 W16X36, eje 3 W10X12; LY 120 cm (eje débil arriostrado por largueros) y LZ = altura de cada eje.</w:t>
-      </w:r>
-    </w:p>
-    <w:p>
-      <w:pPr>
-        <w:spacing w:before="0" w:after="40"/>
-        <w:jc w:val="both"/>
-      </w:pPr>
-      <w:r>
-        <w:rPr>
-          <w:rFonts w:ascii="Arial" w:hAnsi="Arial" w:cs="Arial"/>
-          <w:b w:val="0"/>
-          <w:i w:val="0"/>
-          <w:sz w:val="17"/>
-        </w:rPr>
-        <w:t>•  Vigas de marco espalda con espalda: eje 1 MCE4-14, eje 2 MCE10-14, eje 3 MCE6-14; vigas de alero MCE12-14.</w:t>
-      </w:r>
-    </w:p>
-    <w:p>
-      <w:pPr>
-        <w:spacing w:before="0" w:after="40"/>
-        <w:jc w:val="both"/>
-      </w:pPr>
-      <w:r>
-        <w:rPr>
-          <w:rFonts w:ascii="Arial" w:hAnsi="Arial" w:cs="Arial"/>
-          <w:b w:val="0"/>
-          <w:i w:val="0"/>
-          <w:sz w:val="17"/>
-        </w:rPr>
-        <w:t>•  Largueros de techo: MC12-14 (LT-1, LT-2, LT-3, LT-4, LT-5, LT-6, LT-7, LT-8, LT-9).</w:t>
-      </w:r>
-    </w:p>
-    <w:p>
-      <w:pPr>
-        <w:spacing w:before="0" w:after="40"/>
-        <w:jc w:val="both"/>
-      </w:pPr>
-      <w:r>
-        <w:rPr>
-          <w:rFonts w:ascii="Arial" w:hAnsi="Arial" w:cs="Arial"/>
-          <w:b w:val="0"/>
-          <w:i w:val="0"/>
-          <w:sz w:val="17"/>
-        </w:rPr>
-        <w:t>•  Muros A/B, todos los largueros de 10": 0.60 m MC10-12, 1.80 a 7.80 m MC10-12 (claro 1-2), claro 2-3 MC10-14, 9.00 m claro 1-2 MC10-14; remates de contraflambeo en cajón MCC10-14 (9.45 m claro 1-2) y MCC10-14 (9.00 m claro 2-3).</w:t>
-      </w:r>
-    </w:p>
-    <w:p>
-      <w:pPr>
-        <w:spacing w:before="0" w:after="40"/>
-        <w:jc w:val="both"/>
-      </w:pPr>
-      <w:r>
-        <w:rPr>
-          <w:rFonts w:ascii="Arial" w:hAnsi="Arial" w:cs="Arial"/>
-          <w:b w:val="0"/>
-          <w:i w:val="0"/>
-          <w:sz w:val="17"/>
-        </w:rPr>
-        <w:t>•  Muro 1: largueros largos MC10-12 (7.80 m), MC10-14 (9.00 m), MC10-14 (9.45 m); línea de 6.60 m y dintel de cortina MCC10-14; cortos MC4-14.</w:t>
-      </w:r>
-    </w:p>
-    <w:p>
-      <w:pPr>
-        <w:spacing w:before="0" w:after="40"/>
-        <w:jc w:val="both"/>
-      </w:pPr>
-      <w:r>
-        <w:rPr>
-          <w:rFonts w:ascii="Arial" w:hAnsi="Arial" w:cs="Arial"/>
-          <w:b w:val="0"/>
-          <w:i w:val="0"/>
-          <w:sz w:val="17"/>
-        </w:rPr>
-        <w:t>•  Puertas: jambas de puerta de personal HSST2X2X0.125, marco de cortina HSST6X6X0.125.</w:t>
-      </w:r>
-    </w:p>
-    <w:p>
-      <w:pPr>
-        <w:spacing w:before="0" w:after="40"/>
-        <w:jc w:val="both"/>
-      </w:pPr>
-      <w:r>
-        <w:rPr>
-          <w:rFonts w:ascii="Arial" w:hAnsi="Arial" w:cs="Arial"/>
-          <w:b w:val="0"/>
-          <w:i w:val="0"/>
-          <w:sz w:val="17"/>
-        </w:rPr>
-        <w:t>•  Liberados MY MZ: contraflambeos de techo (PIPS7) y extremos de las líneas de 9.45 m que llegan a columna; tensores de techo y muros A/B Ø1/2" y muro 1 Ø5/8".</w:t>
-      </w:r>
-    </w:p>
-    <w:p>
-      <w:pPr>
-        <w:spacing w:before="0" w:after="40"/>
-        <w:jc w:val="both"/>
-      </w:pPr>
-      <w:r>
-        <w:rPr>
-          <w:rFonts w:ascii="Arial" w:hAnsi="Arial" w:cs="Arial"/>
-          <w:b w:val="0"/>
-          <w:i w:val="0"/>
-          <w:sz w:val="17"/>
-        </w:rPr>
-        <w:t>•  Tensores: techo y muros A/B Redondo Ø1/2", muro 1 Redondo Ø5/8"; contraflambeos de techo PIPS7 y de muros PIPS5.</w:t>
-      </w:r>
-    </w:p>
-    <w:p>
-      <w:pPr>
-        <w:spacing w:before="0" w:after="40"/>
-        <w:jc w:val="both"/>
-      </w:pPr>
-      <w:r>
-        <w:rPr>
-          <w:rFonts w:ascii="Arial" w:hAnsi="Arial" w:cs="Arial"/>
-          <w:b w:val="0"/>
-          <w:i w:val="0"/>
-          <w:sz w:val="17"/>
-        </w:rPr>
-        <w:t>•  Revisión: ratio máximo 0.96, flecha máxima 0.87 de L/180 y deriva máxima 0.0177 (≤ 0.020 con Cd = 6); CUT OFF MODE SHAPE 43.</w:t>
-      </w:r>
-    </w:p>
-    <w:p>
-      <w:pPr>
         <w:spacing w:after="0"/>
         <w:jc w:val="center"/>
       </w:pPr>
@@ -1023,7 +858,7 @@
           <w:i w:val="0"/>
           <w:sz w:val="20"/>
         </w:rPr>
-        <w:t>III. IR</w:t>
+        <w:t>II. IR</w:t>
       </w:r>
     </w:p>
     <w:tbl>
@@ -1971,7 +1806,7 @@
           <w:i w:val="0"/>
           <w:sz w:val="20"/>
         </w:rPr>
-        <w:t>IV. HSS</w:t>
+        <w:t>III. HSS</w:t>
       </w:r>
     </w:p>
     <w:tbl>
@@ -2791,7 +2626,7 @@
           <w:i w:val="0"/>
           <w:sz w:val="20"/>
         </w:rPr>
-        <w:t>V. MONTEN DOBLE MCE</w:t>
+        <w:t>IV. MONTEN DOBLE MCE</w:t>
       </w:r>
     </w:p>
     <w:tbl>
@@ -3867,7 +3702,7 @@
           <w:i w:val="0"/>
           <w:sz w:val="20"/>
         </w:rPr>
-        <w:t>VI. MONTEN CAJON MCC</w:t>
+        <w:t>V. MONTEN CAJON MCC</w:t>
       </w:r>
     </w:p>
     <w:tbl>
@@ -4559,7 +4394,7 @@
           <w:i w:val="0"/>
           <w:sz w:val="20"/>
         </w:rPr>
-        <w:t>VII. MONTEN C SENCILLO</w:t>
+        <w:t>VI. MONTEN C SENCILLO</w:t>
       </w:r>
     </w:p>
     <w:tbl>
@@ -5635,7 +5470,7 @@
           <w:i w:val="0"/>
           <w:sz w:val="20"/>
         </w:rPr>
-        <w:t>VIII. PIPES</w:t>
+        <w:t>VII. PIPES</w:t>
       </w:r>
     </w:p>
     <w:tbl>
@@ -6455,7 +6290,7 @@
           <w:i w:val="0"/>
           <w:sz w:val="20"/>
         </w:rPr>
-        <w:t>IX. CABLES / REDONDO</w:t>
+        <w:t>VIII. CABLES / REDONDO</w:t>
       </w:r>
     </w:p>
     <w:tbl>
@@ -7275,7 +7110,7 @@
           <w:i w:val="0"/>
           <w:sz w:val="20"/>
         </w:rPr>
-        <w:t>X. RESUMEN GENERAL</w:t>
+        <w:t>IX. RESUMEN GENERAL</w:t>
       </w:r>
     </w:p>
     <w:tbl>

</xml_diff>

<commit_message>
002 R1.3_3: desglose con la corrida del usuario (45.22 kg/m2) y modelo 3D en la portada
Co-Authored-By: Claude Opus 5.5 <noreply@anthropic.com>
Claude-Session: https://claude.ai/code/session_01DbpSpoM7qi5cJ9LMKpwgVv
</commit_message>
<xml_diff>
--- a/002/002_DESTRUCTURAL_H5H6_R1.3_3.docx
+++ b/002/002_DESTRUCTURAL_H5H6_R1.3_3.docx
@@ -263,7 +263,7 @@
                 <w:i w:val="0"/>
                 <w:sz w:val="17"/>
               </w:rPr>
-              <w:t>6,880.45 kg</w:t>
+              <w:t>6,945.82 kg</w:t>
             </w:r>
           </w:p>
         </w:tc>
@@ -349,7 +349,7 @@
                 <w:i w:val="0"/>
                 <w:sz w:val="17"/>
               </w:rPr>
-              <w:t>344.02 kg</w:t>
+              <w:t>347.29 kg</w:t>
             </w:r>
           </w:p>
         </w:tc>
@@ -395,7 +395,7 @@
                 <w:i w:val="0"/>
                 <w:sz w:val="17"/>
               </w:rPr>
-              <w:t>7,224.47 kg</w:t>
+              <w:t>7,293.11 kg</w:t>
             </w:r>
           </w:p>
         </w:tc>
@@ -439,7 +439,7 @@
                 <w:i w:val="0"/>
                 <w:sz w:val="17"/>
               </w:rPr>
-              <w:t>44.79 kg/m²</w:t>
+              <w:t>45.22 kg/m²</w:t>
             </w:r>
           </w:p>
         </w:tc>
@@ -462,7 +462,7 @@
                 <w:i w:val="0"/>
                 <w:sz w:val="17"/>
               </w:rPr>
-              <w:t>Modos (motor de análisis)</w:t>
+              <w:t>Modos (corrida R1.3_3)</w:t>
             </w:r>
           </w:p>
         </w:tc>
@@ -525,7 +525,7 @@
                 <w:i w:val="0"/>
                 <w:sz w:val="17"/>
               </w:rPr>
-              <w:t>91.46 %</w:t>
+              <w:t>91.81 %</w:t>
             </w:r>
           </w:p>
         </w:tc>
@@ -569,7 +569,7 @@
                 <w:i w:val="0"/>
                 <w:sz w:val="17"/>
               </w:rPr>
-              <w:t>93.65 %</w:t>
+              <w:t>93.69 %</w:t>
             </w:r>
           </w:p>
         </w:tc>
@@ -797,7 +797,7 @@
       <w:r>
         <w:drawing>
           <wp:inline xmlns:a="http://schemas.openxmlformats.org/drawingml/2006/main" xmlns:pic="http://schemas.openxmlformats.org/drawingml/2006/picture">
-            <wp:extent cx="3780000" cy="2716875"/>
+            <wp:extent cx="5760000" cy="3600000"/>
             <wp:docPr id="1" name="Picture 1"/>
             <wp:cNvGraphicFramePr>
               <a:graphicFrameLocks noChangeAspect="1"/>
@@ -806,7 +806,7 @@
               <a:graphicData uri="http://schemas.openxmlformats.org/drawingml/2006/picture">
                 <pic:pic>
                   <pic:nvPicPr>
-                    <pic:cNvPr id="0" name="general.png"/>
+                    <pic:cNvPr id="0" name="render3d.png"/>
                     <pic:cNvPicPr/>
                   </pic:nvPicPr>
                   <pic:blipFill>
@@ -818,7 +818,7 @@
                   <pic:spPr>
                     <a:xfrm>
                       <a:off x="0" y="0"/>
-                      <a:ext cx="3780000" cy="2716875"/>
+                      <a:ext cx="5760000" cy="3600000"/>
                     </a:xfrm>
                     <a:prstGeom prst="rect"/>
                   </pic:spPr>
@@ -842,7 +842,7 @@
           <w:color w:val="555555"/>
           <w:sz w:val="16"/>
         </w:rPr>
-        <w:t>Vista del modelo R1.3_3</w:t>
+        <w:t>Modelo 3D R1.3_3</w:t>
       </w:r>
     </w:p>
     <w:p>
@@ -3912,7 +3912,7 @@
                 <w:i w:val="0"/>
                 <w:sz w:val="17"/>
               </w:rPr>
-              <w:t>Montén cajón 10" cal. 14 - línea de 6.60 m del muro 1 (dintel de cortina), larguero 9.00 m claro 2-3 (remate de contraflambeos), larguero 9.45 m claro 1-2 (remate de contraflambeos)</w:t>
+              <w:t>Montén cajón 10" cal. 14 - línea de 6.60 m del muro 1 (dintel de cortina), larguero 9.00 m claro 2-3 (remate de contraflambeos), larguero muro 1 a 9.45 m, larguero 9.45 m claro 1-2 (remate de contraflambeos)</w:t>
             </w:r>
           </w:p>
         </w:tc>
@@ -3933,7 +3933,7 @@
                 <w:i w:val="0"/>
                 <w:sz w:val="17"/>
               </w:rPr>
-              <w:t>42.08</w:t>
+              <w:t>52.16</w:t>
             </w:r>
           </w:p>
         </w:tc>
@@ -3975,7 +3975,7 @@
                 <w:i w:val="0"/>
                 <w:sz w:val="17"/>
               </w:rPr>
-              <w:t>545.79</w:t>
+              <w:t>676.53</w:t>
             </w:r>
           </w:p>
         </w:tc>
@@ -4127,7 +4127,7 @@
                 <w:i w:val="0"/>
                 <w:sz w:val="17"/>
               </w:rPr>
-              <w:t>545.79 kg</w:t>
+              <w:t>676.53 kg</w:t>
             </w:r>
           </w:p>
         </w:tc>
@@ -4171,7 +4171,7 @@
                 <w:i w:val="0"/>
                 <w:sz w:val="17"/>
               </w:rPr>
-              <w:t>27.29 kg</w:t>
+              <w:t>33.83 kg</w:t>
             </w:r>
           </w:p>
         </w:tc>
@@ -4215,7 +4215,7 @@
                 <w:i w:val="0"/>
                 <w:sz w:val="17"/>
               </w:rPr>
-              <w:t>573.08 kg</w:t>
+              <w:t>710.36 kg</w:t>
             </w:r>
           </w:p>
         </w:tc>
@@ -4305,7 +4305,7 @@
                 <w:i w:val="0"/>
                 <w:sz w:val="17"/>
               </w:rPr>
-              <w:t>3.55 kg/m²</w:t>
+              <w:t>4.40 kg/m²</w:t>
             </w:r>
           </w:p>
         </w:tc>
@@ -4688,7 +4688,7 @@
                 <w:i w:val="0"/>
                 <w:sz w:val="17"/>
               </w:rPr>
-              <w:t>46.95%</w:t>
+              <w:t>48.03%</w:t>
             </w:r>
           </w:p>
         </w:tc>
@@ -4732,7 +4732,7 @@
                 <w:i w:val="0"/>
                 <w:sz w:val="17"/>
               </w:rPr>
-              <w:t>Montén C 10" cal. 14 - larguero muro 1 a 9.00 m, larguero 9.00 m claro 1-2, largueros muros A/B claro 2-3, larguero muro 1 a 9.45 m</w:t>
+              <w:t>Montén C 10" cal. 14 - larguero muro 1 a 9.00 m, larguero 9.00 m claro 1-2, largueros muros A/B claro 2-3</w:t>
             </w:r>
           </w:p>
         </w:tc>
@@ -4753,7 +4753,7 @@
                 <w:i w:val="0"/>
                 <w:sz w:val="17"/>
               </w:rPr>
-              <w:t>124.16</w:t>
+              <w:t>114.08</w:t>
             </w:r>
           </w:p>
         </w:tc>
@@ -4795,7 +4795,7 @@
                 <w:i w:val="0"/>
                 <w:sz w:val="17"/>
               </w:rPr>
-              <w:t>805.20</w:t>
+              <w:t>739.83</w:t>
             </w:r>
           </w:p>
         </w:tc>
@@ -4816,7 +4816,7 @@
                 <w:i w:val="0"/>
                 <w:sz w:val="17"/>
               </w:rPr>
-              <w:t>27.83%</w:t>
+              <w:t>26.16%</w:t>
             </w:r>
           </w:p>
         </w:tc>
@@ -4944,7 +4944,7 @@
                 <w:i w:val="0"/>
                 <w:sz w:val="17"/>
               </w:rPr>
-              <w:t>22.70%</w:t>
+              <w:t>23.22%</w:t>
             </w:r>
           </w:p>
         </w:tc>
@@ -5072,7 +5072,7 @@
                 <w:i w:val="0"/>
                 <w:sz w:val="17"/>
               </w:rPr>
-              <w:t>2.53%</w:t>
+              <w:t>2.59%</w:t>
             </w:r>
           </w:p>
         </w:tc>
@@ -5203,7 +5203,7 @@
                 <w:i w:val="0"/>
                 <w:sz w:val="17"/>
               </w:rPr>
-              <w:t>2,893.62 kg</w:t>
+              <w:t>2,828.25 kg</w:t>
             </w:r>
           </w:p>
         </w:tc>
@@ -5247,7 +5247,7 @@
                 <w:i w:val="0"/>
                 <w:sz w:val="17"/>
               </w:rPr>
-              <w:t>144.68 kg</w:t>
+              <w:t>141.41 kg</w:t>
             </w:r>
           </w:p>
         </w:tc>
@@ -5291,7 +5291,7 @@
                 <w:i w:val="0"/>
                 <w:sz w:val="17"/>
               </w:rPr>
-              <w:t>3,038.30 kg</w:t>
+              <w:t>2,969.66 kg</w:t>
             </w:r>
           </w:p>
         </w:tc>
@@ -5381,7 +5381,7 @@
                 <w:i w:val="0"/>
                 <w:sz w:val="17"/>
               </w:rPr>
-              <w:t>18.84 kg/m²</w:t>
+              <w:t>18.41 kg/m²</w:t>
             </w:r>
           </w:p>
         </w:tc>
@@ -7617,7 +7617,7 @@
                 <w:i w:val="0"/>
                 <w:sz w:val="17"/>
               </w:rPr>
-              <w:t>545.79</w:t>
+              <w:t>676.53</w:t>
             </w:r>
           </w:p>
         </w:tc>
@@ -7638,7 +7638,7 @@
                 <w:i w:val="0"/>
                 <w:sz w:val="17"/>
               </w:rPr>
-              <w:t>27.29</w:t>
+              <w:t>33.83</w:t>
             </w:r>
           </w:p>
         </w:tc>
@@ -7659,7 +7659,7 @@
                 <w:i w:val="0"/>
                 <w:sz w:val="17"/>
               </w:rPr>
-              <w:t>573.08</w:t>
+              <w:t>710.36</w:t>
             </w:r>
           </w:p>
         </w:tc>
@@ -7680,7 +7680,7 @@
                 <w:i w:val="0"/>
                 <w:sz w:val="17"/>
               </w:rPr>
-              <w:t>3.55</w:t>
+              <w:t>4.40</w:t>
             </w:r>
           </w:p>
         </w:tc>
@@ -7724,7 +7724,7 @@
                 <w:i w:val="0"/>
                 <w:sz w:val="17"/>
               </w:rPr>
-              <w:t>2,893.62</w:t>
+              <w:t>2,828.25</w:t>
             </w:r>
           </w:p>
         </w:tc>
@@ -7745,7 +7745,7 @@
                 <w:i w:val="0"/>
                 <w:sz w:val="17"/>
               </w:rPr>
-              <w:t>144.68</w:t>
+              <w:t>141.41</w:t>
             </w:r>
           </w:p>
         </w:tc>
@@ -7766,7 +7766,7 @@
                 <w:i w:val="0"/>
                 <w:sz w:val="17"/>
               </w:rPr>
-              <w:t>3,038.30</w:t>
+              <w:t>2,969.66</w:t>
             </w:r>
           </w:p>
         </w:tc>
@@ -7787,7 +7787,7 @@
                 <w:i w:val="0"/>
                 <w:sz w:val="17"/>
               </w:rPr>
-              <w:t>18.84</w:t>
+              <w:t>18.41</w:t>
             </w:r>
           </w:p>
         </w:tc>
@@ -8047,7 +8047,7 @@
                 <w:i w:val="0"/>
                 <w:sz w:val="17"/>
               </w:rPr>
-              <w:t>6,880.45</w:t>
+              <w:t>6,945.82</w:t>
             </w:r>
           </w:p>
         </w:tc>
@@ -8069,7 +8069,7 @@
                 <w:i w:val="0"/>
                 <w:sz w:val="17"/>
               </w:rPr>
-              <w:t>344.02</w:t>
+              <w:t>347.29</w:t>
             </w:r>
           </w:p>
         </w:tc>
@@ -8091,7 +8091,7 @@
                 <w:i w:val="0"/>
                 <w:sz w:val="17"/>
               </w:rPr>
-              <w:t>7,224.47</w:t>
+              <w:t>7,293.11</w:t>
             </w:r>
           </w:p>
         </w:tc>
@@ -8113,7 +8113,7 @@
                 <w:i w:val="0"/>
                 <w:sz w:val="17"/>
               </w:rPr>
-              <w:t>44.79</w:t>
+              <w:t>45.22</w:t>
             </w:r>
           </w:p>
         </w:tc>
@@ -8244,7 +8244,7 @@
                 <w:i w:val="0"/>
                 <w:sz w:val="17"/>
               </w:rPr>
-              <w:t>6,880.45 kg</w:t>
+              <w:t>6,945.82 kg</w:t>
             </w:r>
           </w:p>
         </w:tc>
@@ -8288,7 +8288,7 @@
                 <w:i w:val="0"/>
                 <w:sz w:val="17"/>
               </w:rPr>
-              <w:t>344.02 kg</w:t>
+              <w:t>347.29 kg</w:t>
             </w:r>
           </w:p>
         </w:tc>
@@ -8334,7 +8334,7 @@
                 <w:i w:val="0"/>
                 <w:sz w:val="17"/>
               </w:rPr>
-              <w:t>7,224.47 kg</w:t>
+              <w:t>7,293.11 kg</w:t>
             </w:r>
           </w:p>
         </w:tc>
@@ -8424,7 +8424,7 @@
                 <w:i w:val="0"/>
                 <w:sz w:val="17"/>
               </w:rPr>
-              <w:t>44.79 kg/m²</w:t>
+              <w:t>45.22 kg/m²</w:t>
             </w:r>
           </w:p>
         </w:tc>
@@ -8636,7 +8636,7 @@
               <w:rFonts w:cs="Arial"/>
               <w:sz w:val="24"/>
             </w:rPr>
-            <w:t>FPRIN01-4</w:t>
+            <w:t/>
           </w:r>
         </w:p>
         <w:p>
@@ -8653,7 +8653,7 @@
               <w:rFonts w:cs="Arial"/>
               <w:sz w:val="24"/>
             </w:rPr>
-            <w:t>Rev. 0</w:t>
+            <w:t/>
           </w:r>
         </w:p>
       </w:tc>
@@ -9073,7 +9073,7 @@
               <w:sz w:val="20"/>
               <w:szCs w:val="20"/>
             </w:rPr>
-            <w:t>R1.3_3</w:t>
+            <w:t>1.0</w:t>
           </w:r>
         </w:p>
       </w:tc>

</xml_diff>

<commit_message>
002 R1.3_3: desglose con la nueva corrida (45.96 kg/m2)
Co-Authored-By: Claude Opus 5.5 <noreply@anthropic.com>
Claude-Session: https://claude.ai/code/session_01DbpSpoM7qi5cJ9LMKpwgVv
</commit_message>
<xml_diff>
--- a/002/002_DESTRUCTURAL_H5H6_R1.3_3.docx
+++ b/002/002_DESTRUCTURAL_H5H6_R1.3_3.docx
@@ -263,7 +263,7 @@
                 <w:i w:val="0"/>
                 <w:sz w:val="17"/>
               </w:rPr>
-              <w:t>6,945.82 kg</w:t>
+              <w:t>7,059.96 kg</w:t>
             </w:r>
           </w:p>
         </w:tc>
@@ -349,7 +349,7 @@
                 <w:i w:val="0"/>
                 <w:sz w:val="17"/>
               </w:rPr>
-              <w:t>347.29 kg</w:t>
+              <w:t>353.00 kg</w:t>
             </w:r>
           </w:p>
         </w:tc>
@@ -395,7 +395,7 @@
                 <w:i w:val="0"/>
                 <w:sz w:val="17"/>
               </w:rPr>
-              <w:t>7,293.11 kg</w:t>
+              <w:t>7,412.96 kg</w:t>
             </w:r>
           </w:p>
         </w:tc>
@@ -439,7 +439,7 @@
                 <w:i w:val="0"/>
                 <w:sz w:val="17"/>
               </w:rPr>
-              <w:t>45.22 kg/m²</w:t>
+              <w:t>45.96 kg/m²</w:t>
             </w:r>
           </w:p>
         </w:tc>
@@ -525,7 +525,7 @@
                 <w:i w:val="0"/>
                 <w:sz w:val="17"/>
               </w:rPr>
-              <w:t>91.81 %</w:t>
+              <w:t>91.83 %</w:t>
             </w:r>
           </w:p>
         </w:tc>
@@ -569,7 +569,7 @@
                 <w:i w:val="0"/>
                 <w:sz w:val="17"/>
               </w:rPr>
-              <w:t>93.69 %</w:t>
+              <w:t>93.75 %</w:t>
             </w:r>
           </w:p>
         </w:tc>
@@ -2920,7 +2920,7 @@
                 <w:i w:val="0"/>
                 <w:sz w:val="17"/>
               </w:rPr>
-              <w:t>62.53%</w:t>
+              <w:t>54.19%</w:t>
             </w:r>
           </w:p>
         </w:tc>
@@ -2964,7 +2964,7 @@
                 <w:i w:val="0"/>
                 <w:sz w:val="17"/>
               </w:rPr>
-              <w:t>Montén doble 10" cal. 14 - viga de marco eje 2</w:t>
+              <w:t>Montén doble 10" cal. 14 - viga de marco eje 1, viga de marco eje 3, viga de marco eje 2</w:t>
             </w:r>
           </w:p>
         </w:tc>
@@ -2985,7 +2985,7 @@
                 <w:i w:val="0"/>
                 <w:sz w:val="17"/>
               </w:rPr>
-              <w:t>10.08</w:t>
+              <w:t>30.24</w:t>
             </w:r>
           </w:p>
         </w:tc>
@@ -3027,7 +3027,7 @@
                 <w:i w:val="0"/>
                 <w:sz w:val="17"/>
               </w:rPr>
-              <w:t>130.74</w:t>
+              <w:t>392.22</w:t>
             </w:r>
           </w:p>
         </w:tc>
@@ -3048,263 +3048,7 @@
                 <w:i w:val="0"/>
                 <w:sz w:val="17"/>
               </w:rPr>
-              <w:t>17.62%</w:t>
-            </w:r>
-          </w:p>
-        </w:tc>
-      </w:tr>
-      <w:tr>
-        <w:tc>
-          <w:tcPr>
-            <w:tcW w:type="dxa" w:w="1701"/>
-          </w:tcPr>
-          <w:p>
-            <w:pPr>
-              <w:spacing w:before="20" w:after="20"/>
-              <w:jc w:val="left"/>
-            </w:pPr>
-            <w:r/>
-            <w:r>
-              <w:rPr>
-                <w:rFonts w:ascii="Arial" w:hAnsi="Arial" w:cs="Arial"/>
-                <w:b w:val="0"/>
-                <w:i w:val="0"/>
-                <w:sz w:val="17"/>
-              </w:rPr>
-              <w:t>MCE6-14</w:t>
-            </w:r>
-          </w:p>
-        </w:tc>
-        <w:tc>
-          <w:tcPr>
-            <w:tcW w:type="dxa" w:w="3515"/>
-          </w:tcPr>
-          <w:p>
-            <w:pPr>
-              <w:spacing w:before="20" w:after="20"/>
-              <w:jc w:val="left"/>
-            </w:pPr>
-            <w:r/>
-            <w:r>
-              <w:rPr>
-                <w:rFonts w:ascii="Arial" w:hAnsi="Arial" w:cs="Arial"/>
-                <w:b w:val="0"/>
-                <w:i w:val="0"/>
-                <w:sz w:val="17"/>
-              </w:rPr>
-              <w:t>Montén doble 6" cal. 14 - viga de marco eje 3</w:t>
-            </w:r>
-          </w:p>
-        </w:tc>
-        <w:tc>
-          <w:tcPr>
-            <w:tcW w:type="dxa" w:w="1191"/>
-          </w:tcPr>
-          <w:p>
-            <w:pPr>
-              <w:spacing w:before="20" w:after="20"/>
-              <w:jc w:val="right"/>
-            </w:pPr>
-            <w:r/>
-            <w:r>
-              <w:rPr>
-                <w:rFonts w:ascii="Arial" w:hAnsi="Arial" w:cs="Arial"/>
-                <w:b w:val="0"/>
-                <w:i w:val="0"/>
-                <w:sz w:val="17"/>
-              </w:rPr>
-              <w:t>10.08</w:t>
-            </w:r>
-          </w:p>
-        </w:tc>
-        <w:tc>
-          <w:tcPr>
-            <w:tcW w:type="dxa" w:w="907"/>
-          </w:tcPr>
-          <w:p>
-            <w:pPr>
-              <w:spacing w:before="20" w:after="20"/>
-              <w:jc w:val="right"/>
-            </w:pPr>
-            <w:r/>
-            <w:r>
-              <w:rPr>
-                <w:rFonts w:ascii="Arial" w:hAnsi="Arial" w:cs="Arial"/>
-                <w:b w:val="0"/>
-                <w:i w:val="0"/>
-                <w:sz w:val="17"/>
-              </w:rPr>
-              <w:t>8.44</w:t>
-            </w:r>
-          </w:p>
-        </w:tc>
-        <w:tc>
-          <w:tcPr>
-            <w:tcW w:type="dxa" w:w="1191"/>
-          </w:tcPr>
-          <w:p>
-            <w:pPr>
-              <w:spacing w:before="20" w:after="20"/>
-              <w:jc w:val="right"/>
-            </w:pPr>
-            <w:r/>
-            <w:r>
-              <w:rPr>
-                <w:rFonts w:ascii="Arial" w:hAnsi="Arial" w:cs="Arial"/>
-                <w:b w:val="0"/>
-                <w:i w:val="0"/>
-                <w:sz w:val="17"/>
-              </w:rPr>
-              <w:t>85.08</w:t>
-            </w:r>
-          </w:p>
-        </w:tc>
-        <w:tc>
-          <w:tcPr>
-            <w:tcW w:type="dxa" w:w="794"/>
-          </w:tcPr>
-          <w:p>
-            <w:pPr>
-              <w:spacing w:before="20" w:after="20"/>
-              <w:jc w:val="right"/>
-            </w:pPr>
-            <w:r/>
-            <w:r>
-              <w:rPr>
-                <w:rFonts w:ascii="Arial" w:hAnsi="Arial" w:cs="Arial"/>
-                <w:b w:val="0"/>
-                <w:i w:val="0"/>
-                <w:sz w:val="17"/>
-              </w:rPr>
-              <w:t>11.47%</w:t>
-            </w:r>
-          </w:p>
-        </w:tc>
-      </w:tr>
-      <w:tr>
-        <w:tc>
-          <w:tcPr>
-            <w:tcW w:type="dxa" w:w="1701"/>
-          </w:tcPr>
-          <w:p>
-            <w:pPr>
-              <w:spacing w:before="20" w:after="20"/>
-              <w:jc w:val="left"/>
-            </w:pPr>
-            <w:r/>
-            <w:r>
-              <w:rPr>
-                <w:rFonts w:ascii="Arial" w:hAnsi="Arial" w:cs="Arial"/>
-                <w:b w:val="0"/>
-                <w:i w:val="0"/>
-                <w:sz w:val="17"/>
-              </w:rPr>
-              <w:t>MCE4-14</w:t>
-            </w:r>
-          </w:p>
-        </w:tc>
-        <w:tc>
-          <w:tcPr>
-            <w:tcW w:type="dxa" w:w="3515"/>
-          </w:tcPr>
-          <w:p>
-            <w:pPr>
-              <w:spacing w:before="20" w:after="20"/>
-              <w:jc w:val="left"/>
-            </w:pPr>
-            <w:r/>
-            <w:r>
-              <w:rPr>
-                <w:rFonts w:ascii="Arial" w:hAnsi="Arial" w:cs="Arial"/>
-                <w:b w:val="0"/>
-                <w:i w:val="0"/>
-                <w:sz w:val="17"/>
-              </w:rPr>
-              <w:t>Montén doble 4" cal. 14 - viga de marco eje 1</w:t>
-            </w:r>
-          </w:p>
-        </w:tc>
-        <w:tc>
-          <w:tcPr>
-            <w:tcW w:type="dxa" w:w="1191"/>
-          </w:tcPr>
-          <w:p>
-            <w:pPr>
-              <w:spacing w:before="20" w:after="20"/>
-              <w:jc w:val="right"/>
-            </w:pPr>
-            <w:r/>
-            <w:r>
-              <w:rPr>
-                <w:rFonts w:ascii="Arial" w:hAnsi="Arial" w:cs="Arial"/>
-                <w:b w:val="0"/>
-                <w:i w:val="0"/>
-                <w:sz w:val="17"/>
-              </w:rPr>
-              <w:t>10.08</w:t>
-            </w:r>
-          </w:p>
-        </w:tc>
-        <w:tc>
-          <w:tcPr>
-            <w:tcW w:type="dxa" w:w="907"/>
-          </w:tcPr>
-          <w:p>
-            <w:pPr>
-              <w:spacing w:before="20" w:after="20"/>
-              <w:jc w:val="right"/>
-            </w:pPr>
-            <w:r/>
-            <w:r>
-              <w:rPr>
-                <w:rFonts w:ascii="Arial" w:hAnsi="Arial" w:cs="Arial"/>
-                <w:b w:val="0"/>
-                <w:i w:val="0"/>
-                <w:sz w:val="17"/>
-              </w:rPr>
-              <w:t>6.18</w:t>
-            </w:r>
-          </w:p>
-        </w:tc>
-        <w:tc>
-          <w:tcPr>
-            <w:tcW w:type="dxa" w:w="1191"/>
-          </w:tcPr>
-          <w:p>
-            <w:pPr>
-              <w:spacing w:before="20" w:after="20"/>
-              <w:jc w:val="right"/>
-            </w:pPr>
-            <w:r/>
-            <w:r>
-              <w:rPr>
-                <w:rFonts w:ascii="Arial" w:hAnsi="Arial" w:cs="Arial"/>
-                <w:b w:val="0"/>
-                <w:i w:val="0"/>
-                <w:sz w:val="17"/>
-              </w:rPr>
-              <w:t>62.26</w:t>
-            </w:r>
-          </w:p>
-        </w:tc>
-        <w:tc>
-          <w:tcPr>
-            <w:tcW w:type="dxa" w:w="794"/>
-          </w:tcPr>
-          <w:p>
-            <w:pPr>
-              <w:spacing w:before="20" w:after="20"/>
-              <w:jc w:val="right"/>
-            </w:pPr>
-            <w:r/>
-            <w:r>
-              <w:rPr>
-                <w:rFonts w:ascii="Arial" w:hAnsi="Arial" w:cs="Arial"/>
-                <w:b w:val="0"/>
-                <w:i w:val="0"/>
-                <w:sz w:val="17"/>
-              </w:rPr>
-              <w:t>8.39%</w:t>
+              <w:t>45.81%</w:t>
             </w:r>
           </w:p>
         </w:tc>
@@ -3435,7 +3179,7 @@
                 <w:i w:val="0"/>
                 <w:sz w:val="17"/>
               </w:rPr>
-              <w:t>742.07 kg</w:t>
+              <w:t>856.21 kg</w:t>
             </w:r>
           </w:p>
         </w:tc>
@@ -3479,7 +3223,7 @@
                 <w:i w:val="0"/>
                 <w:sz w:val="17"/>
               </w:rPr>
-              <w:t>37.10 kg</w:t>
+              <w:t>42.81 kg</w:t>
             </w:r>
           </w:p>
         </w:tc>
@@ -3523,7 +3267,7 @@
                 <w:i w:val="0"/>
                 <w:sz w:val="17"/>
               </w:rPr>
-              <w:t>779.17 kg</w:t>
+              <w:t>899.02 kg</w:t>
             </w:r>
           </w:p>
         </w:tc>
@@ -3613,7 +3357,7 @@
                 <w:i w:val="0"/>
                 <w:sz w:val="17"/>
               </w:rPr>
-              <w:t>4.83 kg/m²</w:t>
+              <w:t>5.57 kg/m²</w:t>
             </w:r>
           </w:p>
         </w:tc>
@@ -7510,7 +7254,7 @@
                 <w:i w:val="0"/>
                 <w:sz w:val="17"/>
               </w:rPr>
-              <w:t>742.07</w:t>
+              <w:t>856.21</w:t>
             </w:r>
           </w:p>
         </w:tc>
@@ -7531,7 +7275,7 @@
                 <w:i w:val="0"/>
                 <w:sz w:val="17"/>
               </w:rPr>
-              <w:t>37.10</w:t>
+              <w:t>42.81</w:t>
             </w:r>
           </w:p>
         </w:tc>
@@ -7552,7 +7296,7 @@
                 <w:i w:val="0"/>
                 <w:sz w:val="17"/>
               </w:rPr>
-              <w:t>779.17</w:t>
+              <w:t>899.02</w:t>
             </w:r>
           </w:p>
         </w:tc>
@@ -7573,7 +7317,7 @@
                 <w:i w:val="0"/>
                 <w:sz w:val="17"/>
               </w:rPr>
-              <w:t>4.83</w:t>
+              <w:t>5.57</w:t>
             </w:r>
           </w:p>
         </w:tc>
@@ -8047,7 +7791,7 @@
                 <w:i w:val="0"/>
                 <w:sz w:val="17"/>
               </w:rPr>
-              <w:t>6,945.82</w:t>
+              <w:t>7,059.96</w:t>
             </w:r>
           </w:p>
         </w:tc>
@@ -8069,7 +7813,7 @@
                 <w:i w:val="0"/>
                 <w:sz w:val="17"/>
               </w:rPr>
-              <w:t>347.29</w:t>
+              <w:t>353.00</w:t>
             </w:r>
           </w:p>
         </w:tc>
@@ -8091,7 +7835,7 @@
                 <w:i w:val="0"/>
                 <w:sz w:val="17"/>
               </w:rPr>
-              <w:t>7,293.11</w:t>
+              <w:t>7,412.96</w:t>
             </w:r>
           </w:p>
         </w:tc>
@@ -8113,7 +7857,7 @@
                 <w:i w:val="0"/>
                 <w:sz w:val="17"/>
               </w:rPr>
-              <w:t>45.22</w:t>
+              <w:t>45.96</w:t>
             </w:r>
           </w:p>
         </w:tc>
@@ -8244,7 +7988,7 @@
                 <w:i w:val="0"/>
                 <w:sz w:val="17"/>
               </w:rPr>
-              <w:t>6,945.82 kg</w:t>
+              <w:t>7,059.96 kg</w:t>
             </w:r>
           </w:p>
         </w:tc>
@@ -8288,7 +8032,7 @@
                 <w:i w:val="0"/>
                 <w:sz w:val="17"/>
               </w:rPr>
-              <w:t>347.29 kg</w:t>
+              <w:t>353.00 kg</w:t>
             </w:r>
           </w:p>
         </w:tc>
@@ -8334,7 +8078,7 @@
                 <w:i w:val="0"/>
                 <w:sz w:val="17"/>
               </w:rPr>
-              <w:t>7,293.11 kg</w:t>
+              <w:t>7,412.96 kg</w:t>
             </w:r>
           </w:p>
         </w:tc>
@@ -8424,7 +8168,7 @@
                 <w:i w:val="0"/>
                 <w:sz w:val="17"/>
               </w:rPr>
-              <w:t>45.22 kg/m²</w:t>
+              <w:t>45.96 kg/m²</w:t>
             </w:r>
           </w:p>
         </w:tc>

</xml_diff>